<commit_message>
Guia reescrito com H2 como caminho principal
- Guia de execução refeito do zero: instalação do JDK e do Android Studio
  passo a passo, banco H2 sem instalação, console do banco, roteiro de teste,
  três formas de demonstrar o conflito de reserva, 18 problemas comuns
  separados por etapa e checklist de entrega
- MySQL passou para o apêndice A, com o troubleshooting do XAMPP
- Figura nova mostrando o que roda em cada janela
- AA2 ganhou a seção 2.2 explicando os dois bancos
- Roteiro atualizado: comando do H2 na preparação e duas perguntas novas
</commit_message>
<xml_diff>
--- a/docs/AA2_Documentacao_Tecnica.docx
+++ b/docs/AA2_Documentacao_Tecnica.docx
@@ -768,7 +768,54 @@
           <w:sz w:val="24"/>
           <w:szCs w:val="24"/>
         </w:rPr>
-        <w:t xml:space="preserve">2.2 Tecnologias utilizadas</w:t>
+        <w:t xml:space="preserve">2.2 Os dois bancos de dados</w:t>
+      </w:r>
+    </w:p>
+    <w:p>
+      <w:pPr>
+        <w:spacing w:after="120" w:line="360"/>
+        <w:ind w:firstLine="709"/>
+        <w:jc w:val="both"/>
+      </w:pPr>
+      <w:r>
+        <w:rPr>
+          <w:rFonts w:ascii="Arial" w:cs="Arial" w:eastAsia="Arial" w:hAnsi="Arial"/>
+          <w:sz w:val="24"/>
+          <w:szCs w:val="24"/>
+        </w:rPr>
+        <w:t xml:space="preserve">A aplicação roda com MySQL ou com H2, e a escolha é feita por arquivo de configuração: nenhuma linha de código Java muda entre os dois. Isso é possível porque o acesso ao banco passa pelo Spring Data JPA, que abstrai o banco concreto, e é um resultado prático da separação em camadas.</w:t>
+      </w:r>
+    </w:p>
+    <w:p>
+      <w:pPr>
+        <w:spacing w:after="120" w:line="360"/>
+        <w:ind w:firstLine="709"/>
+        <w:jc w:val="both"/>
+      </w:pPr>
+      <w:r>
+        <w:rPr>
+          <w:rFonts w:ascii="Arial" w:cs="Arial" w:eastAsia="Arial" w:hAnsi="Arial"/>
+          <w:sz w:val="24"/>
+          <w:szCs w:val="24"/>
+        </w:rPr>
+        <w:t xml:space="preserve">O MySQL é a configuração pensada para uso real, e o script de criação está em backend/database/jcondo.sql. O H2 é um banco relacional que roda dentro do próprio processo da aplicação, guardando os dados em memória. Como ele recria as tabelas e recarrega os dados de exemplo a cada inicialização, é o que uso para desenvolver e demonstrar: qualquer bagunça feita em teste se desfaz reiniciando a aplicação.</w:t>
+      </w:r>
+    </w:p>
+    <w:p>
+      <w:pPr>
+        <w:pStyle w:val="Heading2"/>
+        <w:spacing w:after="200" w:before="360" w:line="360"/>
+        <w:jc w:val="left"/>
+      </w:pPr>
+      <w:r>
+        <w:rPr>
+          <w:rFonts w:ascii="Arial" w:cs="Arial" w:eastAsia="Arial" w:hAnsi="Arial"/>
+          <w:b/>
+          <w:bCs/>
+          <w:sz w:val="24"/>
+          <w:szCs w:val="24"/>
+        </w:rPr>
+        <w:t xml:space="preserve">2.3 Tecnologias utilizadas</w:t>
       </w:r>
     </w:p>
     <w:p>

</xml_diff>